<commit_message>
Resolve Aux status, banks, hell structure, wolf blood
Co-Authored-By: Claude Sonnet 5.5 <noreply@anthropic.com>
Claude-Session: https://claude.ai/code/session_01JpcpLvtS7aJ4eQsGwHD4Tg
</commit_message>
<xml_diff>
--- a/docx/Carya_Diger_Diyarlar.docx
+++ b/docx/Carya_Diger_Diyarlar.docx
@@ -429,7 +429,7 @@
         <w:rPr>
           <w:rFonts w:ascii="Georgia" w:hAnsi="Georgia" w:cs="Georgia" w:eastAsia="Georgia"/>
         </w:rPr>
-        <w:t>Jökulgard’ın en belirgin özelliği kurt kanıdır. Şehirde yaklaşık her on iki kişiden biri kurt kanı taşır; bu oran kuzeyin diğer şehirlerine kıyasla çok yüksektir ve Jökulgard’ın Greatwolf’a neden bir bekçi değil bir ata gözüyle baktığını da açıklar. Kimsenin damarında ne olduğu açıkça konuşulmaz, ama herkes aşağı yukarı bilir. Kurt kanı taşıyanlar insan biçimindeyken bile tam insan görünmez: kulaklar bir parça sivri, gözler ışığı yanlış tutar, bakışta kehribar bir parıltı vardır. Bunlar Jökulgardlılarca bir aile benzerliği gibi okunur ve üzerinde durulmaz. Dolunay yaklaştıkça işaretler belirginleşir; son gecede saklanmazlar, saklanamazlar. Kısa kuzey yazının sonunda dolunay özellikle net ve büyük doğar; halk buna Kanlı Ay’ın provası der.</w:t>
+        <w:t>Jökulgard’ın en belirgin özelliği kurt kanıdır. Şehirde yaklaşık her on iki kişiden biri kurt kanı taşır; bu oran kuzeyin diğer şehirlerine kıyasla çok yüksektir ve Jökulgard’ın Greatwolf’a neden bir bekçi değil bir ata gözüyle baktığını da açıklar. Kimsenin damarında ne olduğu açıkça konuşulmaz, ama herkes aşağı yukarı bilir. Jökulgardlılar bunu Greatwolf’un armağanı sayar; Likan Laneti ile bir ilişkisi olup olmadığını ise ne tapınak ne bilginler söyleyebilir ve bu soru Jökulgard’da sorulmaz. Kurt kanı taşıyanlar insan biçimindeyken bile tam insan görünmez: kulaklar bir parça sivri, gözler ışığı yanlış tutar, bakışta kehribar bir parıltı vardır. Bunlar Jökulgardlılarca bir aile benzerliği gibi okunur ve üzerinde durulmaz. Dolunay yaklaştıkça işaretler belirginleşir; son gecede saklanmazlar, saklanamazlar. Kısa kuzey yazının sonunda dolunay özellikle net ve büyük doğar; halk buna Kanlı Ay’ın provası der.</w:t>
       </w:r>
     </w:p>
     <w:p>
@@ -589,7 +589,7 @@
         <w:rPr>
           <w:rFonts w:ascii="Georgia" w:hAnsi="Georgia" w:cs="Georgia" w:eastAsia="Georgia"/>
         </w:rPr>
-        <w:t>Aux, insan diyarlarının en eski krallıklarından biridir ve hâlâ bu eski kökenin ağır gururunu taşır. Bir zamanlar çok daha güçlü, çok daha etkili ve çok daha geniş nüfuz sahibi olan şehir, Kurucu Kral I. Florentin’in isyanı ve sonrasında yaşanan kırılmalar yüzünden eski kudretini kaybetmiştir. Buna rağmen Aux, geçmişini unutmak yerine ona daha sıkı sarılmayı seçmiştir. Şehir bugün dışarıya karşı kapalı, içeride ise son derece gelenekçi bir düzenle yönetilir. Aux kralı ve onun soyu, ülkedeki tek gerçek soylu merkez olarak kalmış; diğer asiller ya silinmiş ya da dışlanmıştır. Geri kalan yönetim yapısı ise teoride liyakate dayanır: görevler soydan çok yeterlilikle dağıtılmaya çalışılır. Ancak bu sistem, şehrin aşırı muhafazakâr yapısı yüzünden çoğu zaman yeniliğe değil, eski usullerin başka ellerle sürdürülmesine dönüşür. Aux eski ihtişamına dönmek ister, fakat bunun için gerekli cesur adımları atacak kadar esnek değildir; bu yüzden şehir, büyük bir hatıranın içinde sıkışmış bir insan gururu gibi yaşar.</w:t>
+        <w:t>Aux, insan diyarlarının en eski krallıklarından biridir ve hâlâ bu eski kökenin ağır gururunu taşır. Ona kimi “krallık”, kimi “şehir devleti” der; hangisinin söylendiği bakanın yerine göre değişir. Kralı olan bir şehir devleti de olsa Aux hiçbir zaman bir imparatorluk olmamıştır ve bugün de özgür diyarların içinde sayılır. Bir zamanlar çok daha güçlü, çok daha etkili ve çok daha geniş nüfuz sahibi olan şehir, Kurucu Kral I. Florentin’in isyanı ve sonrasında yaşanan kırılmalar yüzünden eski kudretini kaybetmiştir. Buna rağmen Aux, geçmişini unutmak yerine ona daha sıkı sarılmayı seçmiştir. Şehir bugün dışarıya karşı kapalı, içeride ise son derece gelenekçi bir düzenle yönetilir. Aux kralı ve onun soyu, ülkedeki tek gerçek soylu merkez olarak kalmış; diğer asiller ya silinmiş ya da dışlanmıştır. Geri kalan yönetim yapısı ise teoride liyakate dayanır: görevler soydan çok yeterlilikle dağıtılmaya çalışılır. Ancak bu sistem, şehrin aşırı muhafazakâr yapısı yüzünden çoğu zaman yeniliğe değil, eski usullerin başka ellerle sürdürülmesine dönüşür. Aux eski ihtişamına dönmek ister, fakat bunun için gerekli cesur adımları atacak kadar esnek değildir; bu yüzden şehir, büyük bir hatıranın içinde sıkışmış bir insan gururu gibi yaşar.</w:t>
       </w:r>
     </w:p>
     <w:p>

</xml_diff>

<commit_message>
Resolve El Birligi, northern yarls, Elf-Dwarf wars, Kirik Kalkanlar
Co-Authored-By: Claude Sonnet 5.5 <noreply@anthropic.com>
Claude-Session: https://claude.ai/code/session_01JpcpLvtS7aJ4eQsGwHD4Tg
</commit_message>
<xml_diff>
--- a/docx/Carya_Diger_Diyarlar.docx
+++ b/docx/Carya_Diger_Diyarlar.docx
@@ -293,7 +293,7 @@
         <w:rPr>
           <w:rFonts w:ascii="Georgia" w:hAnsi="Georgia" w:cs="Georgia" w:eastAsia="Georgia"/>
         </w:rPr>
-        <w:t>Kuzeyde dört şehir, bir kral ve üç yarl vardır: Berserkhold, Frostreach, Kaldurvik ve Jökulgard. Berserkhold başkenttir ve goliathların şehridir; kralın meşruiyeti de oradaki Greatwolf tapınağına dayanır. Yarl seçimi şehirden şehre değişir; kral çoğunlukla seçimi yalnızca onaylar. Kuzeyin dört şehri de bugün bilinenlerden çok daha eski yapıların üzerine kuruludur; Berserkhold antik bir kentin üstünde yükselir.</w:t>
+        <w:t>Kuzeyde dört şehir, bir kral ve üç yarl vardır: Berserkhold, Frostreach, Kaldurvik ve Jökulgard. Berserkhold başkenttir, kralın şehridir ve goliathların şehridir; Frostreach, Kaldurvik ve Jökulgard’ın ise birer yarlı vardır. Kralın meşruiyeti de oradaki Greatwolf tapınağına dayanır. Yarl seçimi şehirden şehre değişir; kral çoğunlukla seçimi yalnızca onaylar. Kuzeyin dört şehri de bugün bilinenlerden çok daha eski yapıların üzerine kuruludur; Berserkhold antik bir kentin üstünde yükselir.</w:t>
       </w:r>
     </w:p>
     <w:p>
@@ -324,7 +324,7 @@
         <w:rPr>
           <w:rFonts w:ascii="Georgia" w:hAnsi="Georgia" w:cs="Georgia" w:eastAsia="Georgia"/>
         </w:rPr>
-        <w:t>Berserkhold, kuzeyin en sert ve en acımasız şartları içinde ayakta duran şehirlerden biridir; buz, rüzgâr ve taş burada yalnızca çevre unsuru değil, hayatın bizzat belirleyicisidir. Şehir, büyük bir buz gölüne ve kuzeyin daha da yaban bölgelerine yakın konumuyla doğal olarak dünyadan kopuk bir karakter geliştirmiştir. Nüfusun büyük bölümünü goliathlar oluşturur; bu da şehre yalnız fiziksel değil, kültürel olarak da sert, dayanıklı ve meydan okuyucu bir kimlik kazandırır. Berserkhold’de yaşam bir konfor meselesi değil, dayanma gücü meselesidir. Burada yöneticiler kadar yarllar da önemlidir ve iç çekişmeler eksik olmaz; ancak dış tehlike belirdiğinde bu kavgaların geçici olarak susturulabilmesi, şehrin gerçek gücünü oluşturur. Berserkhold savaşçı bir toplumdur, fakat bu savaşçılık gösteriş için değil hayatta kalmak için doğmuştur. Greatwolf’un etkisi burada çok güçlü hissedilir; iz sürme, av, kışa hazırlık, sınır koruma ve sürü bilinci şehir kültürünün kutsal parçaları gibidir.</w:t>
+        <w:t>Berserkhold, kuzeyin en sert ve en acımasız şartları içinde ayakta duran şehirlerden biridir; buz, rüzgâr ve taş burada yalnızca çevre unsuru değil, hayatın bizzat belirleyicisidir. Şehir, büyük bir buz gölüne ve kuzeyin daha da yaban bölgelerine yakın konumuyla doğal olarak dünyadan kopuk bir karakter geliştirmiştir. Nüfusun büyük bölümünü goliathlar oluşturur; bu da şehre yalnız fiziksel değil, kültürel olarak da sert, dayanıklı ve meydan okuyucu bir kimlik kazandırır. Berserkhold’de yaşam bir konfor meselesi değil, dayanma gücü meselesidir. Burada yöneticiler kadar hane reisleri ve diğer şehirlerin yarlları da önemlidir ve iç çekişmeler eksik olmaz; ancak dış tehlike belirdiğinde bu kavgaların geçici olarak susturulabilmesi, şehrin gerçek gücünü oluşturur. Berserkhold savaşçı bir toplumdur, fakat bu savaşçılık gösteriş için değil hayatta kalmak için doğmuştur. Greatwolf’un etkisi burada çok güçlü hissedilir; iz sürme, av, kışa hazırlık, sınır koruma ve sürü bilinci şehir kültürünün kutsal parçaları gibidir.</w:t>
       </w:r>
     </w:p>
     <w:p>

</xml_diff>

<commit_message>
Align places with the map; fold in details from the older draft
Co-Authored-By: Claude Sonnet 5.5 <noreply@anthropic.com>
Claude-Session: https://claude.ai/code/session_01JpcpLvtS7aJ4eQsGwHD4Tg
</commit_message>
<xml_diff>
--- a/docx/Carya_Diger_Diyarlar.docx
+++ b/docx/Carya_Diger_Diyarlar.docx
@@ -324,7 +324,7 @@
         <w:rPr>
           <w:rFonts w:ascii="Georgia" w:hAnsi="Georgia" w:cs="Georgia" w:eastAsia="Georgia"/>
         </w:rPr>
-        <w:t>Berserkhold, kuzeyin en sert ve en acımasız şartları içinde ayakta duran şehirlerden biridir; buz, rüzgâr ve taş burada yalnızca çevre unsuru değil, hayatın bizzat belirleyicisidir. Şehir, büyük bir buz gölüne ve kuzeyin daha da yaban bölgelerine yakın konumuyla doğal olarak dünyadan kopuk bir karakter geliştirmiştir. Nüfusun büyük bölümünü goliathlar oluşturur; bu da şehre yalnız fiziksel değil, kültürel olarak da sert, dayanıklı ve meydan okuyucu bir kimlik kazandırır. Berserkhold’de yaşam bir konfor meselesi değil, dayanma gücü meselesidir. Burada yöneticiler kadar hane reisleri ve diğer şehirlerin yarlları da önemlidir ve iç çekişmeler eksik olmaz; ancak dış tehlike belirdiğinde bu kavgaların geçici olarak susturulabilmesi, şehrin gerçek gücünü oluşturur. Berserkhold savaşçı bir toplumdur, fakat bu savaşçılık gösteriş için değil hayatta kalmak için doğmuştur. Greatwolf’un etkisi burada çok güçlü hissedilir; iz sürme, av, kışa hazırlık, sınır koruma ve sürü bilinci şehir kültürünün kutsal parçaları gibidir.</w:t>
+        <w:t>Berserkhold, kuzeyin en sert ve en acımasız şartları içinde ayakta duran şehirlerden biridir; buz, rüzgâr ve taş burada yalnızca çevre unsuru değil, hayatın bizzat belirleyicisidir. Şehir, kuzeydeki geniş buzlu körfeze ve kuzeyin daha da yaban bölgelerine yakın konumuyla doğal olarak dünyadan kopuk bir karakter geliştirmiştir. Nüfusun büyük bölümünü goliathlar oluşturur; bu da şehre yalnız fiziksel değil, kültürel olarak da sert, dayanıklı ve meydan okuyucu bir kimlik kazandırır. Berserkhold’de yaşam bir konfor meselesi değil, dayanma gücü meselesidir. Burada yöneticiler kadar hane reisleri ve diğer şehirlerin yarlları da önemlidir ve iç çekişmeler eksik olmaz; ancak dış tehlike belirdiğinde bu kavgaların geçici olarak susturulabilmesi, şehrin gerçek gücünü oluşturur. Berserkhold savaşçı bir toplumdur, fakat bu savaşçılık gösteriş için değil hayatta kalmak için doğmuştur. Greatwolf’un etkisi burada çok güçlü hissedilir; iz sürme, av, kışa hazırlık, sınır koruma ve sürü bilinci şehir kültürünün kutsal parçaları gibidir.</w:t>
       </w:r>
     </w:p>
     <w:p>
@@ -417,7 +417,7 @@
         <w:rPr>
           <w:rFonts w:ascii="Georgia" w:hAnsi="Georgia" w:cs="Georgia" w:eastAsia="Georgia"/>
         </w:rPr>
-        <w:t>Jökulgard, dört şehrin en küçüğü ve en sessizidir; Berserkhold ile Frostreach arasında, dağlarla çevrili korunaklı bir vadinin tabanında kurulmuştur. Vadiye giriş tek bir doğal geçitten, kışın kar yığınlarıyla daralan Kurtboğazı’ndan (Ulvstrupet) sağlanır; bu yüzden Jökulgard’a tesadüfen gelinmez, bilerek girilir. Vadinin ortasından geçen donuk Iskald nehri şehri ikiye böler. Nüfusu on ile yirmi bin arasındadır; çoğunluk insandır, ama azımsanamayacak bir goliath ve cüce azınlığı da vardır. Şehrin etrafında sur yoktur; yerine sivri kazıklardan ve dikenli çalılıklardan bir çit hattı (Törngard) çekilmiştir, ama bu av hayvanlarını dışarıda tutmak için değil, kimin içeri girip kimin dışarı çıktığını görünür kılmak içindir.</w:t>
+        <w:t>Jökulgard, dört şehrin en küçüğü ve en sessizidir; kuzeybatı kıyının içlerinde, Kaldurvik ile Frostreach arasında, dağlarla çevrili korunaklı bir vadinin tabanında kurulmuştur. Vadiye giriş tek bir doğal geçitten, kışın kar yığınlarıyla daralan Kurtboğazı’ndan (Ulvstrupet) sağlanır; bu yüzden Jökulgard’a tesadüfen gelinmez, bilerek girilir. Vadinin ortasından geçen donuk Iskald nehri şehri ikiye böler. Nüfusu on ile yirmi bin arasındadır; çoğunluk insandır, ama azımsanamayacak bir goliath ve cüce azınlığı da vardır. Şehrin etrafında sur yoktur; yerine sivri kazıklardan ve dikenli çalılıklardan bir çit hattı (Törngard) çekilmiştir, ama bu av hayvanlarını dışarıda tutmak için değil, kimin içeri girip kimin dışarı çıktığını görünür kılmak içindir.</w:t>
       </w:r>
     </w:p>
     <w:p>

</xml_diff>

<commit_message>
Write the Aux Kingdom article
Aux becomes the first human kingdom whose king claims to be emperor of
all humans; its faith honours only Amarath and Alarath, only the royal
line is noble, offices go by merit, and the houses that left Aux are
explained. The Free Cities entry keeps a short summary, and the Word
document and wiki site are rebuilt.

Co-Authored-By: Claude Opus 5.5 <noreply@anthropic.com>
Claude-Session: https://claude.ai/code/session_01Mfzr2E3Ey9o3G5KUSC6GaD
</commit_message>
<xml_diff>
--- a/docx/Carya_Diger_Diyarlar.docx
+++ b/docx/Carya_Diger_Diyarlar.docx
@@ -31,7 +31,7 @@
           <w:sz w:val="28"/>
           <w:szCs w:val="28"/>
         </w:rPr>
-        <w:t>Elf Federasyonu, Cüce Krallığı, Kuzey Krallığı ve Özgür Şehirler</w:t>
+        <w:t>Elf Federasyonu, Cüce Krallığı, Kuzey Krallığı, Özgür Şehirler ve Aux Krallığı</w:t>
       </w:r>
     </w:p>
     <w:p>
@@ -589,7 +589,7 @@
         <w:rPr>
           <w:rFonts w:ascii="Georgia" w:hAnsi="Georgia" w:cs="Georgia" w:eastAsia="Georgia"/>
         </w:rPr>
-        <w:t>Aux, insan diyarlarının en eski krallıklarından biridir ve hâlâ bu eski kökenin ağır gururunu taşır. Ona kimi “krallık”, kimi “şehir devleti” der; hangisinin söylendiği bakanın yerine göre değişir. Kralı olan bir şehir devleti de olsa Aux hiçbir zaman bir imparatorluk olmamıştır ve bugün de özgür diyarların içinde sayılır. Bir zamanlar çok daha güçlü, çok daha etkili ve çok daha geniş nüfuz sahibi olan şehir, Kurucu Kral I. Florentin’in isyanı ve sonrasında yaşanan kırılmalar yüzünden eski kudretini kaybetmiştir. Buna rağmen Aux, geçmişini unutmak yerine ona daha sıkı sarılmayı seçmiştir. Şehir bugün dışarıya karşı kapalı, içeride ise son derece gelenekçi bir düzenle yönetilir. Aux kralı ve onun soyu, ülkedeki tek gerçek soylu merkez olarak kalmış; diğer asiller ya silinmiş ya da dışlanmıştır. Geri kalan yönetim yapısı ise teoride liyakate dayanır: görevler soydan çok yeterlilikle dağıtılmaya çalışılır. Ancak bu sistem, şehrin aşırı muhafazakâr yapısı yüzünden çoğu zaman yeniliğe değil, eski usullerin başka ellerle sürdürülmesine dönüşür. Aux eski ihtişamına dönmek ister, fakat bunun için gerekli cesur adımları atacak kadar esnek değildir; bu yüzden şehir, büyük bir hatıranın içinde sıkışmış bir insan gururu gibi yaşar.</w:t>
+        <w:t>Aux, insanların kurduğu ilk krallıktır ve ejderha çağında insan soyuna yuva olmuştur. Kralı olan bir şehir devleti olarak özgür diyarlar arasında sayılır; ancak Aux kralı kendini bütün insanların imparatoru görür ve Kurucu Kral I. Florentin’in isyanıyla doğan İmparatorluğu, ne kadar büyük olursa olsun, aşağı görür. Ülke dışa kapalı, son derece kuralcı ve gelenekçidir: inancı yalnızca Amarath ile Alarath’a yönelir, kral soyundan başka soylu tanımaz ve devlet görevlerini liyakatle dağıtır. Ayrıntılar için bkz. Aux Krallığı.</w:t>
       </w:r>
     </w:p>
     <w:p>
@@ -621,6 +621,501 @@
           <w:rFonts w:ascii="Georgia" w:hAnsi="Georgia" w:cs="Georgia" w:eastAsia="Georgia"/>
         </w:rPr>
         <w:t>Cortax, birbirine bağlı adalar ve liman yerleşimlerinden oluşan, korsan geleneğini kurumsallaştırmış özgür bir deniz şehridir. Burada düzen, dışarıdan bakana kaos gibi görünür; fakat bu görünüş aldatıcıdır. Cortax’ta ihanet mümkündür ama anlaşma bozmak affedilmez; bu yüzden korsan geleneği kaba kuvvet kadar sözün bağlayıcılığı üzerine de kuruludur. Şehrin ticareti, yağması, denizciliği ve yeraltı anlaşmaları bu katı korsan töresiyle ayakta durur. Kraken’in etkisi burada yalnızca dinsel değil, kültüreldir de; deniz, korku, sadakat ve karşılığını verme anlayışı halkın zihnine derin biçimde işlemiştir. Suç neredeyse yok gibidir, çünkü herkes bilir ki çizgi aşılırsa ceza yalnız insanlar tarafından değil, denizin kendisi tarafından da gelir. Cortax’ın halkı sert, özgüvenli ve fırsatçıdır; fakat aynı zamanda kendi düzenlerine olağanüstü sadıktır. Şehir, karadaki krallıkların gözünde bir korsan yuvası olabilir, ama kendi içinde son derece işleyen ve kendine yeterli bir deniz cumhuriyeti gibidir.</w:t>
+      </w:r>
+    </w:p>
+    <w:p>
+      <w:pPr>
+        <w:pStyle w:val="Heading1"/>
+        <w:keepNext w:val="1"/>
+        <w:keepLines w:val="1"/>
+        <w:spacing w:before="360" w:after="200" w:line="240" w:lineRule="auto"/>
+      </w:pPr>
+      <w:r>
+        <w:rPr>
+          <w:rFonts w:ascii="Georgia" w:hAnsi="Georgia" w:cs="Georgia" w:eastAsia="Georgia"/>
+          <w:b w:val="1"/>
+          <w:bCs w:val="1"/>
+          <w:color w:val="5B4A2E"/>
+          <w:sz w:val="32"/>
+          <w:szCs w:val="32"/>
+        </w:rPr>
+        <w:t>Aux Krallığı</w:t>
+      </w:r>
+    </w:p>
+    <w:p>
+      <w:pPr>
+        <w:spacing w:after="160" w:line="276" w:lineRule="auto"/>
+        <w:jc w:val="both"/>
+      </w:pPr>
+      <w:r>
+        <w:rPr>
+          <w:rFonts w:ascii="Georgia" w:hAnsi="Georgia" w:cs="Georgia" w:eastAsia="Georgia"/>
+        </w:rPr>
+        <w:t>Aux, insanların kurduğu ilk krallıktır. Taş surların ardında yaşayan, yabancıya kapısını kolay açmayan, kurallarını herkesten sıkı tutan bu eski ülke, Carya’daki bütün insan soylarının beşiği sayılır. Ona kimi “krallık”, kimi “şehir devleti” der; hangisinin söylendiği bakanın yerine göre değişir. Bugün özgür diyarlar arasında sayılsa da Aux tahtı bu sıfatı hiçbir zaman kabul etmemiştir: Aux kralı kendini yalnızca Aux’un değil, bütün insanların imparatoru olarak görür.</w:t>
+      </w:r>
+    </w:p>
+    <w:p>
+      <w:pPr>
+        <w:pStyle w:val="Heading2"/>
+        <w:keepNext w:val="1"/>
+        <w:keepLines w:val="1"/>
+        <w:spacing w:before="240" w:after="140" w:line="240" w:lineRule="auto"/>
+      </w:pPr>
+      <w:r>
+        <w:rPr>
+          <w:rFonts w:ascii="Georgia" w:hAnsi="Georgia" w:cs="Georgia" w:eastAsia="Georgia"/>
+          <w:b w:val="1"/>
+          <w:bCs w:val="1"/>
+          <w:color w:val="6E5A38"/>
+          <w:sz w:val="26"/>
+          <w:szCs w:val="26"/>
+        </w:rPr>
+        <w:t>İlk İnsan Krallığı</w:t>
+      </w:r>
+    </w:p>
+    <w:p>
+      <w:pPr>
+        <w:spacing w:after="160" w:line="276" w:lineRule="auto"/>
+        <w:jc w:val="both"/>
+      </w:pPr>
+      <w:r>
+        <w:rPr>
+          <w:rFonts w:ascii="Georgia" w:hAnsi="Georgia" w:cs="Georgia" w:eastAsia="Georgia"/>
+        </w:rPr>
+        <w:t>İnsanları Amarath ile Alarath yaratmıştır ve Aux, bu yeni halkın ilk kez bir taht etrafında toplandığı yerdir. Ejderhaların gökyüzünde dolaştığı çağlarda açık arazide yaşamak ölüm demekti; insanlar yüksek kayalıklara oyulmuş sığınaklara, kalın taş duvarların ardına çekilmek zorundaydı. Aux bu sığınakların en büyüğü ve en güvenlisi oldu. Ejderha çağı boyunca dağınık insan toplulukları, kaçabildikleri her yerden Aux’un surlarına sığındı; ülke bu yüzden yalnızca bir krallık değil, insan soyunun hayatta kaldığı yuva olarak hatırlanır.</w:t>
+      </w:r>
+    </w:p>
+    <w:p>
+      <w:pPr>
+        <w:spacing w:after="160" w:line="276" w:lineRule="auto"/>
+        <w:jc w:val="both"/>
+      </w:pPr>
+      <w:r>
+        <w:rPr>
+          <w:rFonts w:ascii="Georgia" w:hAnsi="Georgia" w:cs="Georgia" w:eastAsia="Georgia"/>
+        </w:rPr>
+        <w:t>Ejderhalar azalıp ova yeniden yaşanabilir hâle geldiğinde Aux’un nüfuzu kıtanın büyük bölümüne yayıldı. Elf-Cüce Savaşları başladığında Aux çoktan güçlü bir krallıktı; elfler ve cüceler birbirleriyle uğraşırken insanların çoğalıp geliştiği yer de büyük ölçüde Aux’un toprakları oldu. Bugün Aux’un kale kentleri, kuleli taş köprüleri ve sarp yamaçlara tutunmuş köyleri, o eski sığınak döneminin izlerini hâlâ taşır.</w:t>
+      </w:r>
+    </w:p>
+    <w:p>
+      <w:pPr>
+        <w:pStyle w:val="Heading2"/>
+        <w:keepNext w:val="1"/>
+        <w:keepLines w:val="1"/>
+        <w:spacing w:before="240" w:after="140" w:line="240" w:lineRule="auto"/>
+      </w:pPr>
+      <w:r>
+        <w:rPr>
+          <w:rFonts w:ascii="Georgia" w:hAnsi="Georgia" w:cs="Georgia" w:eastAsia="Georgia"/>
+          <w:b w:val="1"/>
+          <w:bCs w:val="1"/>
+          <w:color w:val="6E5A38"/>
+          <w:sz w:val="26"/>
+          <w:szCs w:val="26"/>
+        </w:rPr>
+        <w:t>Taht ve İmparatorluk İddiası</w:t>
+      </w:r>
+    </w:p>
+    <w:p>
+      <w:pPr>
+        <w:spacing w:after="160" w:line="276" w:lineRule="auto"/>
+        <w:jc w:val="both"/>
+      </w:pPr>
+      <w:r>
+        <w:rPr>
+          <w:rFonts w:ascii="Georgia" w:hAnsi="Georgia" w:cs="Georgia" w:eastAsia="Georgia"/>
+        </w:rPr>
+        <w:t>Aux tahtı, insan soyunun ilk tahtı olduğu için kendini bütün insanların meşru yöneticisi sayar. Aux kralı resmî yazışmalarında kendini “bütün insanların imparatoru” olarak tanıtır; bu unvanı Aux dışında kimse kullanmaz, fakat Aux içinde kimse de sorgulamaz.</w:t>
+      </w:r>
+    </w:p>
+    <w:p>
+      <w:pPr>
+        <w:spacing w:after="160" w:line="276" w:lineRule="auto"/>
+        <w:jc w:val="both"/>
+      </w:pPr>
+      <w:r>
+        <w:rPr>
+          <w:rFonts w:ascii="Georgia" w:hAnsi="Georgia" w:cs="Georgia" w:eastAsia="Georgia"/>
+        </w:rPr>
+        <w:t>Florentina’ya bakış bu iddiadan doğar. Kurucu Kral I. Florentin, Aux’a bağlı bir lord iken tahta isyan etmiş, Florentina şehrini kurup kendini kral ilan etmiştir. Aux’un gözünde İmparatorluk, ne kadar büyümüş olursa olsun, babasına başkaldırmış bir oğulun kurduğu düzendir. Bu yüzden Aux, kendinden kat kat geniş ve kalabalık olan İmparatorluğu hâlâ aşağı görür; Florentina’nın imparatorunu bir “isyancı lordun varisi” olarak anar ve onun unvanını tanımaz. Bu tutum İmparatorluk sarayında çoğu zaman alayla karşılanır, ancak Aux’un bu inadından hiç vazgeçmemesi de bir tür saygı uyandırır.</w:t>
+      </w:r>
+    </w:p>
+    <w:p>
+      <w:pPr>
+        <w:pStyle w:val="Heading2"/>
+        <w:keepNext w:val="1"/>
+        <w:keepLines w:val="1"/>
+        <w:spacing w:before="240" w:after="140" w:line="240" w:lineRule="auto"/>
+      </w:pPr>
+      <w:r>
+        <w:rPr>
+          <w:rFonts w:ascii="Georgia" w:hAnsi="Georgia" w:cs="Georgia" w:eastAsia="Georgia"/>
+          <w:b w:val="1"/>
+          <w:bCs w:val="1"/>
+          <w:color w:val="6E5A38"/>
+          <w:sz w:val="26"/>
+          <w:szCs w:val="26"/>
+        </w:rPr>
+        <w:t>İnanç</w:t>
+      </w:r>
+    </w:p>
+    <w:p>
+      <w:pPr>
+        <w:spacing w:after="160" w:line="276" w:lineRule="auto"/>
+        <w:jc w:val="both"/>
+      </w:pPr>
+      <w:r>
+        <w:rPr>
+          <w:rFonts w:ascii="Georgia" w:hAnsi="Georgia" w:cs="Georgia" w:eastAsia="Georgia"/>
+        </w:rPr>
+        <w:t>Aux’un inancı yalnızca köke, yani insanları yaratan Amarath ile Alarath’a yönelir. Amarath düzenin ve tahtın, Alarath şefkatin ve korumanın kaynağı olarak birlikte anılır; tapınaklarda ikisinin adı her zaman yan yana okunur.</w:t>
+      </w:r>
+    </w:p>
+    <w:p>
+      <w:pPr>
+        <w:spacing w:after="160" w:line="276" w:lineRule="auto"/>
+        <w:jc w:val="both"/>
+      </w:pPr>
+      <w:r>
+        <w:rPr>
+          <w:rFonts w:ascii="Georgia" w:hAnsi="Georgia" w:cs="Georgia" w:eastAsia="Georgia"/>
+        </w:rPr>
+        <w:t>Amarath ile Alarath’ın oğullarına tapınmak Aux’ta sapkınlık sayılır. Aux din adamlarına göre oğullar, Horus’un İsyanı’nda gösterdiği üzere, babalarına başkaldırabilecek varlıklardır; içlerinden sadık kalanlar olsa bile bir oğula dua etmek, kökü bırakıp dala tutunmak demektir. Bu öğreti Aux’un siyasi hafızasıyla da örtüşür: tanrıların oğulları nasıl babalarına isyan ettiyse Florentina da Aux’a öyle isyan etmiştir. Yeryüzü Tapınağı’nın Russ, Gulliman ve Vulkan’ı da kutsal saymasını Aux, imparatorluğun kendi isyanını kutsamasının bir parçası olarak görür.</w:t>
+      </w:r>
+    </w:p>
+    <w:p>
+      <w:pPr>
+        <w:spacing w:after="160" w:line="276" w:lineRule="auto"/>
+        <w:jc w:val="both"/>
+      </w:pPr>
+      <w:r>
+        <w:rPr>
+          <w:rFonts w:ascii="Georgia" w:hAnsi="Georgia" w:cs="Georgia" w:eastAsia="Georgia"/>
+        </w:rPr>
+        <w:t>Aux tapınağı, İmparatorluktaki tapınaktan çok daha içe kapanıktır. Yabancı din adamlarını kabul etmez, kendi yazılarını dışarıya vermez ve kurallarını sorgulatmaz. Tarih boyunca oğullara da dua etmek isteyen aileler bu baskı yüzünden ülkeyi terk etmek zorunda kalmıştır.</w:t>
+      </w:r>
+    </w:p>
+    <w:p>
+      <w:pPr>
+        <w:pStyle w:val="Heading2"/>
+        <w:keepNext w:val="1"/>
+        <w:keepLines w:val="1"/>
+        <w:spacing w:before="240" w:after="140" w:line="240" w:lineRule="auto"/>
+      </w:pPr>
+      <w:r>
+        <w:rPr>
+          <w:rFonts w:ascii="Georgia" w:hAnsi="Georgia" w:cs="Georgia" w:eastAsia="Georgia"/>
+          <w:b w:val="1"/>
+          <w:bCs w:val="1"/>
+          <w:color w:val="6E5A38"/>
+          <w:sz w:val="26"/>
+          <w:szCs w:val="26"/>
+        </w:rPr>
+        <w:t>Yönetim ve Liyakat</w:t>
+      </w:r>
+    </w:p>
+    <w:p>
+      <w:pPr>
+        <w:spacing w:after="160" w:line="276" w:lineRule="auto"/>
+        <w:jc w:val="both"/>
+      </w:pPr>
+      <w:r>
+        <w:rPr>
+          <w:rFonts w:ascii="Georgia" w:hAnsi="Georgia" w:cs="Georgia" w:eastAsia="Georgia"/>
+        </w:rPr>
+        <w:t>Aux’ta tek soylu soy, kral soyudur. Bu soy da bilerek küçük tutulur: İmparatorlukta tek bir şehirde yüzlerce soylu bulunabilirken Aux’ta soylu sayılan kişilerin sayısı çoğu zaman üç ile beş arasındadır. Tahttan uzaklaşan kollar unvanlarını yitirir ve halkın içine karışır. Soylu sayısının bu kadar az olması, kral ailesini halkın gözünde neredeyse kutsal bir yere taşımıştır.</w:t>
+      </w:r>
+    </w:p>
+    <w:p>
+      <w:pPr>
+        <w:spacing w:after="160" w:line="276" w:lineRule="auto"/>
+        <w:jc w:val="both"/>
+      </w:pPr>
+      <w:r>
+        <w:rPr>
+          <w:rFonts w:ascii="Georgia" w:hAnsi="Georgia" w:cs="Georgia" w:eastAsia="Georgia"/>
+        </w:rPr>
+        <w:t>Kral ailesinin dışında herkes yasa önünde eşit sayılır. Toprak, ambar ve atölyeler büyük ölçüde ortak düzenle işletilir; kimse doğuştan bir ayrıcalığa sahip değildir. Devlet görevleri soya göre değil, yeterliliğe göre dağıtılır. Bir köylü çocuğu, sınavlardan geçip kendini kanıtladığında kralın başdanışmanı ya da bütün orduların birinci komutanı olabilir; Aux tarihinde bunun pek çok örneği vardır.</w:t>
+      </w:r>
+    </w:p>
+    <w:p>
+      <w:pPr>
+        <w:spacing w:after="160" w:line="276" w:lineRule="auto"/>
+        <w:jc w:val="both"/>
+      </w:pPr>
+      <w:r>
+        <w:rPr>
+          <w:rFonts w:ascii="Georgia" w:hAnsi="Georgia" w:cs="Georgia" w:eastAsia="Georgia"/>
+        </w:rPr>
+        <w:t>Bu düzen kâğıt üzerinde kusursuzdur, ancak ülkenin aşırı muhafazakâr yapısı yüzünden çoğu zaman yeniliğe değil, eski usullerin başka ellerle sürdürülmesine dönüşür. Rüşvet ve kayırma tamamen yok olmamıştır; kapalı kapılar ardında hâlâ yaşar. Fakat yakalanmanın bedeli o kadar ağırdır ki bunu göze alan azdır.</w:t>
+      </w:r>
+    </w:p>
+    <w:p>
+      <w:pPr>
+        <w:pStyle w:val="Heading2"/>
+        <w:keepNext w:val="1"/>
+        <w:keepLines w:val="1"/>
+        <w:spacing w:before="240" w:after="140" w:line="240" w:lineRule="auto"/>
+      </w:pPr>
+      <w:r>
+        <w:rPr>
+          <w:rFonts w:ascii="Georgia" w:hAnsi="Georgia" w:cs="Georgia" w:eastAsia="Georgia"/>
+          <w:b w:val="1"/>
+          <w:bCs w:val="1"/>
+          <w:color w:val="6E5A38"/>
+          <w:sz w:val="26"/>
+          <w:szCs w:val="26"/>
+        </w:rPr>
+        <w:t>Gündelik Hayat</w:t>
+      </w:r>
+    </w:p>
+    <w:p>
+      <w:pPr>
+        <w:spacing w:after="160" w:line="276" w:lineRule="auto"/>
+        <w:jc w:val="both"/>
+      </w:pPr>
+      <w:r>
+        <w:rPr>
+          <w:rFonts w:ascii="Georgia" w:hAnsi="Georgia" w:cs="Georgia" w:eastAsia="Georgia"/>
+        </w:rPr>
+        <w:t>Aux’ta kurallar katıdır ve herkes tarafından bilinir. Sokaklarda büyü yapmak yasaktır; büyü ancak tapınağın ve tahtın izin verdiği yerlerde, sıkı denetim altında kullanılabilir. Gece kapıları erken kapanır, şehirler arası yollar düzenli olarak denetlenir, yabancılar kayıt altına alınır.</w:t>
+      </w:r>
+    </w:p>
+    <w:p>
+      <w:pPr>
+        <w:spacing w:after="160" w:line="276" w:lineRule="auto"/>
+        <w:jc w:val="both"/>
+      </w:pPr>
+      <w:r>
+        <w:rPr>
+          <w:rFonts w:ascii="Georgia" w:hAnsi="Georgia" w:cs="Georgia" w:eastAsia="Georgia"/>
+        </w:rPr>
+        <w:t>Bu sıkılığın karşılığı huzurdur. Aux’ta suç oranı diyarın en düşüğüdür; yolda soyulmak, gece sokakta kaybolmak ya da pazarda dolandırılmak burada nadir yaşanan şeylerdir. Halk bu düzenden memnundur, ancak dışarıdan gelenler için Aux sıkıcı bir yerdir. Maceracılar Aux’a pek uğramaz: ne kiralık bir iş, ne yasak bir harabe, ne de kimsenin sormadığı bir kavga bulunur. Aux’un halkı ise bunu bir övünç meselesi sayar.</w:t>
+      </w:r>
+    </w:p>
+    <w:p>
+      <w:pPr>
+        <w:spacing w:after="160" w:line="276" w:lineRule="auto"/>
+        <w:jc w:val="both"/>
+      </w:pPr>
+      <w:r>
+        <w:rPr>
+          <w:rFonts w:ascii="Georgia" w:hAnsi="Georgia" w:cs="Georgia" w:eastAsia="Georgia"/>
+        </w:rPr>
+        <w:t>İnsanlar taş kalelerin içinde ya da onların gölgesindeki köylerde yaşar. Kale, yalnızca bir savunma yapısı değil, ortak ambarın, mahkemenin, tapınağın ve meclisin bir araya geldiği yerdir. Ejderha çağından kalma bu yaşayış biçimi, Aux insanını içe dönük, ölçülü ve birbirine sıkı bağlı bir topluluk hâline getirmiştir.</w:t>
+      </w:r>
+    </w:p>
+    <w:p>
+      <w:pPr>
+        <w:pStyle w:val="Heading2"/>
+        <w:keepNext w:val="1"/>
+        <w:keepLines w:val="1"/>
+        <w:spacing w:before="240" w:after="140" w:line="240" w:lineRule="auto"/>
+      </w:pPr>
+      <w:r>
+        <w:rPr>
+          <w:rFonts w:ascii="Georgia" w:hAnsi="Georgia" w:cs="Georgia" w:eastAsia="Georgia"/>
+          <w:b w:val="1"/>
+          <w:bCs w:val="1"/>
+          <w:color w:val="6E5A38"/>
+          <w:sz w:val="26"/>
+          <w:szCs w:val="26"/>
+        </w:rPr>
+        <w:t>Ordu</w:t>
+      </w:r>
+    </w:p>
+    <w:p>
+      <w:pPr>
+        <w:spacing w:after="160" w:line="276" w:lineRule="auto"/>
+        <w:jc w:val="both"/>
+      </w:pPr>
+      <w:r>
+        <w:rPr>
+          <w:rFonts w:ascii="Georgia" w:hAnsi="Georgia" w:cs="Georgia" w:eastAsia="Georgia"/>
+        </w:rPr>
+        <w:t>Aux ordusunun belkemiği zırhlı süvari şövalyeleridir. Bu şövalyeler soylu değildir; tıpkı devlet görevlileri gibi yetenekleriyle seçilir, kalelerde yetiştirilir ve tahta yemin eder. Ağır süvari hücumu Aux’un savaştaki en bilinen gücüdür.</w:t>
+      </w:r>
+    </w:p>
+    <w:p>
+      <w:pPr>
+        <w:spacing w:after="160" w:line="276" w:lineRule="auto"/>
+        <w:jc w:val="both"/>
+      </w:pPr>
+      <w:r>
+        <w:rPr>
+          <w:rFonts w:ascii="Georgia" w:hAnsi="Georgia" w:cs="Georgia" w:eastAsia="Georgia"/>
+        </w:rPr>
+        <w:t>Aux, tarih boyunca İmparatorlukla birçok kez karşı karşıya gelmiştir. Zaman zaman Aquamere’i ya da İmparatorluğa ait bazı kasabaları ve sınır kalelerini ele geçirmeyi başarmış, ancak bu kazanımlar genellikle kısa sürmüştür. İmparatorluğun nüfusu ve kaynakları karşısında Aux uzun bir savaşı sürdüremez; bu yüzden savaşlarını çoğunlukla hızlı süvari baskınları ve güçlü kale savunmalarıyla yürütür.</w:t>
+      </w:r>
+    </w:p>
+    <w:p>
+      <w:pPr>
+        <w:pStyle w:val="Heading2"/>
+        <w:keepNext w:val="1"/>
+        <w:keepLines w:val="1"/>
+        <w:spacing w:before="240" w:after="140" w:line="240" w:lineRule="auto"/>
+      </w:pPr>
+      <w:r>
+        <w:rPr>
+          <w:rFonts w:ascii="Georgia" w:hAnsi="Georgia" w:cs="Georgia" w:eastAsia="Georgia"/>
+          <w:b w:val="1"/>
+          <w:bCs w:val="1"/>
+          <w:color w:val="6E5A38"/>
+          <w:sz w:val="26"/>
+          <w:szCs w:val="26"/>
+        </w:rPr>
+        <w:t>Ticaret ve Komşular</w:t>
+      </w:r>
+    </w:p>
+    <w:p>
+      <w:pPr>
+        <w:spacing w:after="160" w:line="276" w:lineRule="auto"/>
+        <w:jc w:val="both"/>
+      </w:pPr>
+      <w:r>
+        <w:rPr>
+          <w:rFonts w:ascii="Georgia" w:hAnsi="Georgia" w:cs="Georgia" w:eastAsia="Georgia"/>
+        </w:rPr>
+        <w:t>Dışa kapalı olmasına rağmen Aux ticaret yapar. Özellikle diğer özgür şehirlerle, Omnialis, Shahdadia ve Cortax ile iyi geçinir; bu şehirler Aux’un kurallarına karışmadığı ve imparatorluk iddiasıyla uğraşmadığı için Aux da onlara karşı ölçülü ve güvenilir bir ortaktır. Aux tüccarları dürüstlükleri ve pazarlıktaki inatlarıyla tanınır. İmparatorlukla ticaret ise vardır ama soğuktur; iki taraf da birbirinin malını alır, fakat birbirinin unvanını tanımaz.</w:t>
+      </w:r>
+    </w:p>
+    <w:p>
+      <w:pPr>
+        <w:pStyle w:val="Heading2"/>
+        <w:keepNext w:val="1"/>
+        <w:keepLines w:val="1"/>
+        <w:spacing w:before="240" w:after="140" w:line="240" w:lineRule="auto"/>
+      </w:pPr>
+      <w:r>
+        <w:rPr>
+          <w:rFonts w:ascii="Georgia" w:hAnsi="Georgia" w:cs="Georgia" w:eastAsia="Georgia"/>
+          <w:b w:val="1"/>
+          <w:bCs w:val="1"/>
+          <w:color w:val="6E5A38"/>
+          <w:sz w:val="26"/>
+          <w:szCs w:val="26"/>
+        </w:rPr>
+        <w:t>Aux’tan Ayrılan Haneler</w:t>
+      </w:r>
+    </w:p>
+    <w:p>
+      <w:pPr>
+        <w:spacing w:after="160" w:line="276" w:lineRule="auto"/>
+        <w:jc w:val="both"/>
+      </w:pPr>
+      <w:r>
+        <w:rPr>
+          <w:rFonts w:ascii="Georgia" w:hAnsi="Georgia" w:cs="Georgia" w:eastAsia="Georgia"/>
+        </w:rPr>
+        <w:t>Aux bir zamanlar pek çok soylu haneye ev sahipliği yapıyordu. Tahtın aşırı merkeziyetçi yapısı, sıkı inanç kuralları ve soylulara giderek daha az yer bırakan düzeni, bu hanelerin birer birer ülkeyi terk etmesine yol açtı. Gidenlerin çoğu İmparatorluğa sığındı:</w:t>
+      </w:r>
+    </w:p>
+    <w:p>
+      <w:pPr>
+        <w:numPr>
+          <w:ilvl w:val="0"/>
+          <w:numId w:val="90"/>
+        </w:numPr>
+        <w:spacing w:after="80" w:line="276" w:lineRule="auto"/>
+        <w:ind w:left="720" w:hanging="360"/>
+      </w:pPr>
+      <w:r>
+        <w:rPr>
+          <w:rFonts w:ascii="Georgia" w:hAnsi="Georgia" w:cs="Georgia" w:eastAsia="Georgia"/>
+          <w:b w:val="1"/>
+          <w:bCs w:val="1"/>
+        </w:rPr>
+        <w:t>O’Connor:</w:t>
+      </w:r>
+      <w:r>
+        <w:rPr>
+          <w:rFonts w:ascii="Georgia" w:hAnsi="Georgia" w:cs="Georgia" w:eastAsia="Georgia"/>
+        </w:rPr>
+        <w:t xml:space="preserve"> Florentin’in isyanında Aux safında Florentina’ya karşı savaştılar, ancak zamanla Aux’tan kaçmak zorunda kalıp Serenquill’e yerleştiler.</w:t>
+      </w:r>
+    </w:p>
+    <w:p>
+      <w:pPr>
+        <w:numPr>
+          <w:ilvl w:val="0"/>
+          <w:numId w:val="90"/>
+        </w:numPr>
+        <w:spacing w:after="80" w:line="276" w:lineRule="auto"/>
+        <w:ind w:left="720" w:hanging="360"/>
+      </w:pPr>
+      <w:r>
+        <w:rPr>
+          <w:rFonts w:ascii="Georgia" w:hAnsi="Georgia" w:cs="Georgia" w:eastAsia="Georgia"/>
+          <w:b w:val="1"/>
+          <w:bCs w:val="1"/>
+        </w:rPr>
+        <w:t>La Seraphine:</w:t>
+      </w:r>
+      <w:r>
+        <w:rPr>
+          <w:rFonts w:ascii="Georgia" w:hAnsi="Georgia" w:cs="Georgia" w:eastAsia="Georgia"/>
+        </w:rPr>
+        <w:t xml:space="preserve"> Aux’taki dini baskılardan kaçtılar. İmparatorlukta oğullara da tapan Yeryüzü Tapınağı’nı benimseyip onun en katı savunucularından biri oldular.</w:t>
+      </w:r>
+    </w:p>
+    <w:p>
+      <w:pPr>
+        <w:numPr>
+          <w:ilvl w:val="0"/>
+          <w:numId w:val="90"/>
+        </w:numPr>
+        <w:spacing w:after="80" w:line="276" w:lineRule="auto"/>
+        <w:ind w:left="720" w:hanging="360"/>
+      </w:pPr>
+      <w:r>
+        <w:rPr>
+          <w:rFonts w:ascii="Georgia" w:hAnsi="Georgia" w:cs="Georgia" w:eastAsia="Georgia"/>
+          <w:b w:val="1"/>
+          <w:bCs w:val="1"/>
+        </w:rPr>
+        <w:t>Von Draken:</w:t>
+      </w:r>
+      <w:r>
+        <w:rPr>
+          <w:rFonts w:ascii="Georgia" w:hAnsi="Georgia" w:cs="Georgia" w:eastAsia="Georgia"/>
+        </w:rPr>
+        <w:t xml:space="preserve"> Büyüyle üretilmiş eşyaların ticaretine yöneldiler. Sokakta büyünün yasak olduğu bir ülkede bu işin geleceği yoktu; Arcan’s Gate’e geçip servetlerini orada büyüttüler.</w:t>
+      </w:r>
+    </w:p>
+    <w:p>
+      <w:pPr>
+        <w:numPr>
+          <w:ilvl w:val="0"/>
+          <w:numId w:val="90"/>
+        </w:numPr>
+        <w:spacing w:after="80" w:line="276" w:lineRule="auto"/>
+        <w:ind w:left="720" w:hanging="360"/>
+      </w:pPr>
+      <w:r>
+        <w:rPr>
+          <w:rFonts w:ascii="Georgia" w:hAnsi="Georgia" w:cs="Georgia" w:eastAsia="Georgia"/>
+          <w:b w:val="1"/>
+          <w:bCs w:val="1"/>
+        </w:rPr>
+        <w:t>Del Valle:</w:t>
+      </w:r>
+      <w:r>
+        <w:rPr>
+          <w:rFonts w:ascii="Georgia" w:hAnsi="Georgia" w:cs="Georgia" w:eastAsia="Georgia"/>
+        </w:rPr>
+        <w:t xml:space="preserve"> Aux’tan ayrılan son soylu hanedir. Onların Aquamere’e göçüyle birlikte Aux’ta kral soyundan başka soylu kalmadı.</w:t>
+      </w:r>
+    </w:p>
+    <w:p>
+      <w:pPr>
+        <w:spacing w:after="160" w:line="276" w:lineRule="auto"/>
+        <w:jc w:val="both"/>
+      </w:pPr>
+      <w:r>
+        <w:rPr>
+          <w:rFonts w:ascii="Georgia" w:hAnsi="Georgia" w:cs="Georgia" w:eastAsia="Georgia"/>
+        </w:rPr>
+        <w:t>Bu hanelerin İmparatorluktaki varlığı, Aux’un gözünde kaybedilmiş bir mirastır; İmparatorluğun gözünde ise Aux’un katılığının en açık kanıtı.</w:t>
       </w:r>
     </w:p>
     <w:sectPr>

</xml_diff>

<commit_message>
Add the royal banner of Aux
Aux shows its sign on an old-style vertical banner instead of a shield:
a plain closed silver crown on deep navy. The banner leads the Aux
article, joins the arms gallery, and the Word document and wiki are
rebuilt. Tall images now print 6 cm high in Word.

Co-Authored-By: Claude Opus 5.5 <noreply@anthropic.com>
Claude-Session: https://claude.ai/code/session_01Mfzr2E3Ey9o3G5KUSC6GaD
</commit_message>
<xml_diff>
--- a/docx/Carya_Diger_Diyarlar.docx
+++ b/docx/Carya_Diger_Diyarlar.docx
@@ -644,6 +644,47 @@
     </w:p>
     <w:p>
       <w:pPr>
+        <w:keepNext w:val="1"/>
+        <w:spacing w:before="60" w:after="160" w:line="240" w:lineRule="auto"/>
+        <w:jc w:val="center"/>
+      </w:pPr>
+      <w:r>
+        <w:drawing>
+          <wp:inline xmlns:a="http://schemas.openxmlformats.org/drawingml/2006/main" xmlns:pic="http://schemas.openxmlformats.org/drawingml/2006/picture">
+            <wp:extent cx="696600" cy="2160000"/>
+            <wp:docPr id="1" name="Aux kraliyet sancağı" descr="Aux kraliyet sancağı"/>
+            <wp:cNvGraphicFramePr>
+              <a:graphicFrameLocks noChangeAspect="1"/>
+            </wp:cNvGraphicFramePr>
+            <a:graphic>
+              <a:graphicData uri="http://schemas.openxmlformats.org/drawingml/2006/picture">
+                <pic:pic>
+                  <pic:nvPicPr>
+                    <pic:cNvPr id="0" name="sancak_Aux.png"/>
+                    <pic:cNvPicPr/>
+                  </pic:nvPicPr>
+                  <pic:blipFill>
+                    <a:blip r:embed="rId10"/>
+                    <a:stretch>
+                      <a:fillRect/>
+                    </a:stretch>
+                  </pic:blipFill>
+                  <pic:spPr>
+                    <a:xfrm>
+                      <a:off x="0" y="0"/>
+                      <a:ext cx="696600" cy="2160000"/>
+                    </a:xfrm>
+                    <a:prstGeom prst="rect"/>
+                  </pic:spPr>
+                </pic:pic>
+              </a:graphicData>
+            </a:graphic>
+          </wp:inline>
+        </w:drawing>
+      </w:r>
+    </w:p>
+    <w:p>
+      <w:pPr>
         <w:spacing w:after="160" w:line="276" w:lineRule="auto"/>
         <w:jc w:val="both"/>
       </w:pPr>
@@ -738,6 +779,18 @@
           <w:rFonts w:ascii="Georgia" w:hAnsi="Georgia" w:cs="Georgia" w:eastAsia="Georgia"/>
         </w:rPr>
         <w:t>Florentina’ya bakış bu iddiadan doğar. Kurucu Kral I. Florentin, Aux’a bağlı bir lord iken tahta isyan etmiş, Florentina şehrini kurup kendini kral ilan etmiştir. Aux’un gözünde İmparatorluk, ne kadar büyümüş olursa olsun, babasına başkaldırmış bir oğulun kurduğu düzendir. Bu yüzden Aux, kendinden kat kat geniş ve kalabalık olan İmparatorluğu hâlâ aşağı görür; Florentina’nın imparatorunu bir “isyancı lordun varisi” olarak anar ve onun unvanını tanımaz. Bu tutum İmparatorluk sarayında çoğu zaman alayla karşılanır, ancak Aux’un bu inadından hiç vazgeçmemesi de bir tür saygı uyandırır.</w:t>
+      </w:r>
+    </w:p>
+    <w:p>
+      <w:pPr>
+        <w:spacing w:after="160" w:line="276" w:lineRule="auto"/>
+        <w:jc w:val="both"/>
+      </w:pPr>
+      <w:r>
+        <w:rPr>
+          <w:rFonts w:ascii="Georgia" w:hAnsi="Georgia" w:cs="Georgia" w:eastAsia="Georgia"/>
+        </w:rPr>
+        <w:t>Aux’un sancağı da bu iddianın sade bir ifadesidir: lacivert, dik bir sancağın ortasında mücevhersiz, çiçeksiz, kemerleri tepede kapanan gümüş bir taç. Kapalı taç imparatorluğun işaretidir; Aux onu süssüz bırakarak gücün süsten değil, kökten geldiğini söyler. Aux, kalkanlar üzerine çizilen armaları sonradan çıkmış bir soylu süsü sayar ve kendi işaretini yalnızca sancakta taşır. İmparatorluktaki yüzlerce hanenin kalkanları karşısında bu tek sancak, Aux’un gözünde kimin daha eski olduğunun yeterli kanıtıdır.</w:t>
       </w:r>
     </w:p>
     <w:p>

</xml_diff>